<commit_message>
feat: criar apostila interativa super detalhada sobre Ferramentas da Qualidade (13 seções com SVGs, exemplos e tema light/dark)
</commit_message>
<xml_diff>
--- a/MATERIAIS/GESTAO_E_CONTROLE_MATERIAIS/ANALISE_DADOS_APLICADA_GESTAO/ATIVIDADES/Prova Objetiva.docx
+++ b/MATERIAIS/GESTAO_E_CONTROLE_MATERIAIS/ANALISE_DADOS_APLICADA_GESTAO/ATIVIDADES/Prova Objetiva.docx
@@ -911,48 +911,6 @@
           <w:bCs/>
         </w:rPr>
       </w:pPr>
-      <w:r>
-        <w:rPr>
-          <w:b/>
-          <w:bCs/>
-          <w:noProof/>
-        </w:rPr>
-        <w:drawing>
-          <wp:inline distT="114300" distB="114300" distL="114300" distR="114300" wp14:anchorId="32E6D054" wp14:editId="5BD30526">
-            <wp:extent cx="5399730" cy="2070100"/>
-            <wp:effectExtent l="0" t="0" r="0" b="0"/>
-            <wp:docPr id="1777767502" name="image4.png"/>
-            <wp:cNvGraphicFramePr/>
-            <a:graphic xmlns:a="http://schemas.openxmlformats.org/drawingml/2006/main">
-              <a:graphicData uri="http://schemas.openxmlformats.org/drawingml/2006/picture">
-                <pic:pic xmlns:pic="http://schemas.openxmlformats.org/drawingml/2006/picture">
-                  <pic:nvPicPr>
-                    <pic:cNvPr id="0" name="image4.png"/>
-                    <pic:cNvPicPr preferRelativeResize="0"/>
-                  </pic:nvPicPr>
-                  <pic:blipFill>
-                    <a:blip r:embed="rId7"/>
-                    <a:srcRect/>
-                    <a:stretch>
-                      <a:fillRect/>
-                    </a:stretch>
-                  </pic:blipFill>
-                  <pic:spPr>
-                    <a:xfrm>
-                      <a:off x="0" y="0"/>
-                      <a:ext cx="5399730" cy="2070100"/>
-                    </a:xfrm>
-                    <a:prstGeom prst="rect">
-                      <a:avLst/>
-                    </a:prstGeom>
-                    <a:ln/>
-                  </pic:spPr>
-                </pic:pic>
-              </a:graphicData>
-            </a:graphic>
-          </wp:inline>
-        </w:drawing>
-      </w:r>
     </w:p>
     <w:tbl>
       <w:tblPr>
@@ -1140,7 +1098,7 @@
                           <pic:cNvPicPr preferRelativeResize="0"/>
                         </pic:nvPicPr>
                         <pic:blipFill>
-                          <a:blip r:embed="rId8"/>
+                          <a:blip r:embed="rId7"/>
                           <a:srcRect/>
                           <a:stretch>
                             <a:fillRect/>
@@ -1620,7 +1578,7 @@
                           <pic:cNvPicPr preferRelativeResize="0"/>
                         </pic:nvPicPr>
                         <pic:blipFill>
-                          <a:blip r:embed="rId9"/>
+                          <a:blip r:embed="rId8"/>
                           <a:srcRect/>
                           <a:stretch>
                             <a:fillRect/>
@@ -2055,18 +2013,7 @@
                 <w:szCs w:val="20"/>
                 <w:highlight w:val="white"/>
               </w:rPr>
-              <w:t xml:space="preserve">Você como um técnico eletromecânico, baseado no princípio de funcionamento e uso dos sensores industriais, precisa fazer uma aplicação de limitação de abertura de uma porta metálica, para a </w:t>
-            </w:r>
-            <w:r>
-              <w:rPr>
-                <w:rFonts w:ascii="Arial" w:eastAsia="Arial" w:hAnsi="Arial" w:cs="Arial"/>
-                <w:color w:val="000000"/>
-                <w:sz w:val="20"/>
-                <w:szCs w:val="20"/>
-                <w:highlight w:val="white"/>
-              </w:rPr>
-              <w:lastRenderedPageBreak/>
-              <w:t>segurança e melhoria no controle e processo da máquina, pois com a máquina em funcionamento a porta não pode ser aberta, e se fora aberta a máquina tem que interromper seu funcionamento.</w:t>
+              <w:t>Você como um técnico eletromecânico, baseado no princípio de funcionamento e uso dos sensores industriais, precisa fazer uma aplicação de limitação de abertura de uma porta metálica, para a segurança e melhoria no controle e processo da máquina, pois com a máquina em funcionamento a porta não pode ser aberta, e se fora aberta a máquina tem que interromper seu funcionamento.</w:t>
             </w:r>
           </w:p>
           <w:p>
@@ -2422,6 +2369,7 @@
                 <w:sz w:val="20"/>
                 <w:szCs w:val="20"/>
               </w:rPr>
+              <w:lastRenderedPageBreak/>
               <w:t xml:space="preserve">CAPACIDADE: </w:t>
             </w:r>
             <w:r>
@@ -2940,7 +2888,7 @@
                           <pic:cNvPicPr preferRelativeResize="0"/>
                         </pic:nvPicPr>
                         <pic:blipFill>
-                          <a:blip r:embed="rId10"/>
+                          <a:blip r:embed="rId9"/>
                           <a:srcRect/>
                           <a:stretch>
                             <a:fillRect/>
@@ -3933,6 +3881,7 @@
   <w:style w:type="character" w:default="1" w:styleId="Fontepargpadro">
     <w:name w:val="Default Paragraph Font"/>
     <w:uiPriority w:val="1"/>
+    <w:semiHidden/>
     <w:unhideWhenUsed/>
   </w:style>
   <w:style w:type="table" w:default="1" w:styleId="Tabelanormal">

</xml_diff>